<commit_message>
cap nhat ket qua chay thuc te
</commit_message>
<xml_diff>
--- a/report/Sorting_Report_Template.docx
+++ b/report/Sorting_Report_Template.docx
@@ -625,14 +625,7 @@
             <w:vAlign w:val="center"/>
           </w:tcPr>
           <w:p>
-            <w:pPr>
-              <w:jc w:val="center"/>
-            </w:pPr>
-            <w:r>
-              <w:rPr>
-                <w:rFonts w:ascii="Times New Roman" w:hAnsi="Times New Roman" w:eastAsia="Times New Roman"/>
-                <w:sz w:val="18"/>
-              </w:rPr>
+            <w:r>
               <w:t>1 (tăng)</w:t>
             </w:r>
           </w:p>
@@ -644,56 +637,40 @@
           </w:tcPr>
           <w:p>
             <w:r>
-              <w:rPr>
-                <w:rFonts w:ascii="Times New Roman" w:hAnsi="Times New Roman" w:eastAsia="Times New Roman"/>
-                <w:sz w:val="18"/>
-              </w:rPr>
-              <w:t>8.000</w:t>
-            </w:r>
-          </w:p>
-        </w:tc>
-        <w:tc>
-          <w:tcPr>
-            <w:tcW w:w="1871" w:type="dxa"/>
-            <w:vAlign w:val="center"/>
-          </w:tcPr>
-          <w:p>
-            <w:r>
-              <w:rPr>
-                <w:rFonts w:ascii="Times New Roman" w:hAnsi="Times New Roman" w:eastAsia="Times New Roman"/>
-                <w:sz w:val="18"/>
-              </w:rPr>
-              <w:t>103.000</w:t>
-            </w:r>
-          </w:p>
-        </w:tc>
-        <w:tc>
-          <w:tcPr>
-            <w:tcW w:w="1871" w:type="dxa"/>
-            <w:vAlign w:val="center"/>
-          </w:tcPr>
-          <w:p>
-            <w:r>
-              <w:rPr>
-                <w:rFonts w:ascii="Times New Roman" w:hAnsi="Times New Roman" w:eastAsia="Times New Roman"/>
-                <w:sz w:val="18"/>
-              </w:rPr>
-              <w:t>191.000</w:t>
-            </w:r>
-          </w:p>
-        </w:tc>
-        <w:tc>
-          <w:tcPr>
-            <w:tcW w:w="1871" w:type="dxa"/>
-            <w:vAlign w:val="center"/>
-          </w:tcPr>
-          <w:p>
-            <w:r>
-              <w:rPr>
-                <w:rFonts w:ascii="Times New Roman" w:hAnsi="Times New Roman" w:eastAsia="Times New Roman"/>
-                <w:sz w:val="18"/>
-              </w:rPr>
-              <w:t>8.000</w:t>
+              <w:t>17.333</w:t>
+            </w:r>
+          </w:p>
+        </w:tc>
+        <w:tc>
+          <w:tcPr>
+            <w:tcW w:w="1871" w:type="dxa"/>
+            <w:vAlign w:val="center"/>
+          </w:tcPr>
+          <w:p>
+            <w:r>
+              <w:t>188.667</w:t>
+            </w:r>
+          </w:p>
+        </w:tc>
+        <w:tc>
+          <w:tcPr>
+            <w:tcW w:w="1871" w:type="dxa"/>
+            <w:vAlign w:val="center"/>
+          </w:tcPr>
+          <w:p>
+            <w:r>
+              <w:t>345.000</w:t>
+            </w:r>
+          </w:p>
+        </w:tc>
+        <w:tc>
+          <w:tcPr>
+            <w:tcW w:w="1871" w:type="dxa"/>
+            <w:vAlign w:val="center"/>
+          </w:tcPr>
+          <w:p>
+            <w:r>
+              <w:t>12.667</w:t>
             </w:r>
           </w:p>
         </w:tc>
@@ -708,89 +685,52 @@
             <w:vAlign w:val="center"/>
           </w:tcPr>
           <w:p>
-            <w:pPr>
-              <w:jc w:val="center"/>
-            </w:pPr>
-            <w:r>
-              <w:rPr>
-                <w:rFonts w:ascii="Times New Roman" w:hAnsi="Times New Roman" w:eastAsia="Times New Roman"/>
-                <w:sz w:val="18"/>
-              </w:rPr>
-              <w:t>2 (gi</w:t>
-            </w:r>
-            <w:r>
-              <w:rPr>
-                <w:rFonts w:ascii="Times New Roman" w:hAnsi="Times New Roman" w:eastAsia="Times New Roman"/>
-                <w:sz w:val="18"/>
-              </w:rPr>
-              <w:t>ả</w:t>
-            </w:r>
-            <w:r>
-              <w:rPr>
-                <w:rFonts w:ascii="Times New Roman" w:hAnsi="Times New Roman" w:eastAsia="Times New Roman"/>
-                <w:sz w:val="18"/>
-              </w:rPr>
-              <w:t>m)</w:t>
-            </w:r>
-          </w:p>
-        </w:tc>
-        <w:tc>
-          <w:tcPr>
-            <w:tcW w:w="1871" w:type="dxa"/>
-            <w:vAlign w:val="center"/>
-          </w:tcPr>
-          <w:p>
-            <w:r>
-              <w:rPr>
-                <w:rFonts w:ascii="Times New Roman" w:hAnsi="Times New Roman" w:eastAsia="Times New Roman"/>
-                <w:sz w:val="18"/>
-              </w:rPr>
-              <w:t>14.000</w:t>
-            </w:r>
-          </w:p>
-        </w:tc>
-        <w:tc>
-          <w:tcPr>
-            <w:tcW w:w="1871" w:type="dxa"/>
-            <w:vAlign w:val="center"/>
-          </w:tcPr>
-          <w:p>
-            <w:r>
-              <w:rPr>
-                <w:rFonts w:ascii="Times New Roman" w:hAnsi="Times New Roman" w:eastAsia="Times New Roman"/>
-                <w:sz w:val="18"/>
-              </w:rPr>
-              <w:t>109.000</w:t>
-            </w:r>
-          </w:p>
-        </w:tc>
-        <w:tc>
-          <w:tcPr>
-            <w:tcW w:w="1871" w:type="dxa"/>
-            <w:vAlign w:val="center"/>
-          </w:tcPr>
-          <w:p>
-            <w:r>
-              <w:rPr>
-                <w:rFonts w:ascii="Times New Roman" w:hAnsi="Times New Roman" w:eastAsia="Times New Roman"/>
-                <w:sz w:val="18"/>
-              </w:rPr>
-              <w:t>169.000</w:t>
-            </w:r>
-          </w:p>
-        </w:tc>
-        <w:tc>
-          <w:tcPr>
-            <w:tcW w:w="1871" w:type="dxa"/>
-            <w:vAlign w:val="center"/>
-          </w:tcPr>
-          <w:p>
-            <w:r>
-              <w:rPr>
-                <w:rFonts w:ascii="Times New Roman" w:hAnsi="Times New Roman" w:eastAsia="Times New Roman"/>
-                <w:sz w:val="18"/>
-              </w:rPr>
-              <w:t>8.000</w:t>
+            <w:r>
+              <w:t>2 (giảm)</w:t>
+            </w:r>
+          </w:p>
+        </w:tc>
+        <w:tc>
+          <w:tcPr>
+            <w:tcW w:w="1871" w:type="dxa"/>
+            <w:vAlign w:val="center"/>
+          </w:tcPr>
+          <w:p>
+            <w:r>
+              <w:t>13.333</w:t>
+            </w:r>
+          </w:p>
+        </w:tc>
+        <w:tc>
+          <w:tcPr>
+            <w:tcW w:w="1871" w:type="dxa"/>
+            <w:vAlign w:val="center"/>
+          </w:tcPr>
+          <w:p>
+            <w:r>
+              <w:t>193.333</w:t>
+            </w:r>
+          </w:p>
+        </w:tc>
+        <w:tc>
+          <w:tcPr>
+            <w:tcW w:w="1871" w:type="dxa"/>
+            <w:vAlign w:val="center"/>
+          </w:tcPr>
+          <w:p>
+            <w:r>
+              <w:t>340.667</w:t>
+            </w:r>
+          </w:p>
+        </w:tc>
+        <w:tc>
+          <w:tcPr>
+            <w:tcW w:w="1871" w:type="dxa"/>
+            <w:vAlign w:val="center"/>
+          </w:tcPr>
+          <w:p>
+            <w:r>
+              <w:t>14.667</w:t>
             </w:r>
           </w:p>
         </w:tc>
@@ -805,89 +745,52 @@
             <w:vAlign w:val="center"/>
           </w:tcPr>
           <w:p>
-            <w:pPr>
-              <w:jc w:val="center"/>
-            </w:pPr>
-            <w:r>
-              <w:rPr>
-                <w:rFonts w:ascii="Times New Roman" w:hAnsi="Times New Roman" w:eastAsia="Times New Roman"/>
-                <w:sz w:val="18"/>
-              </w:rPr>
-              <w:t>3 (ng</w:t>
-            </w:r>
-            <w:r>
-              <w:rPr>
-                <w:rFonts w:ascii="Times New Roman" w:hAnsi="Times New Roman" w:eastAsia="Times New Roman"/>
-                <w:sz w:val="18"/>
-              </w:rPr>
-              <w:t>ẫ</w:t>
-            </w:r>
-            <w:r>
-              <w:rPr>
-                <w:rFonts w:ascii="Times New Roman" w:hAnsi="Times New Roman" w:eastAsia="Times New Roman"/>
-                <w:sz w:val="18"/>
-              </w:rPr>
-              <w:t>u nhiên)</w:t>
-            </w:r>
-          </w:p>
-        </w:tc>
-        <w:tc>
-          <w:tcPr>
-            <w:tcW w:w="1871" w:type="dxa"/>
-            <w:vAlign w:val="center"/>
-          </w:tcPr>
-          <w:p>
-            <w:r>
-              <w:rPr>
-                <w:rFonts w:ascii="Times New Roman" w:hAnsi="Times New Roman" w:eastAsia="Times New Roman"/>
-                <w:sz w:val="18"/>
-              </w:rPr>
-              <w:t>90.000</w:t>
-            </w:r>
-          </w:p>
-        </w:tc>
-        <w:tc>
-          <w:tcPr>
-            <w:tcW w:w="1871" w:type="dxa"/>
-            <w:vAlign w:val="center"/>
-          </w:tcPr>
-          <w:p>
-            <w:r>
-              <w:rPr>
-                <w:rFonts w:ascii="Times New Roman" w:hAnsi="Times New Roman" w:eastAsia="Times New Roman"/>
-                <w:sz w:val="18"/>
-              </w:rPr>
-              <w:t>156.000</w:t>
-            </w:r>
-          </w:p>
-        </w:tc>
-        <w:tc>
-          <w:tcPr>
-            <w:tcW w:w="1871" w:type="dxa"/>
-            <w:vAlign w:val="center"/>
-          </w:tcPr>
-          <w:p>
-            <w:r>
-              <w:rPr>
-                <w:rFonts w:ascii="Times New Roman" w:hAnsi="Times New Roman" w:eastAsia="Times New Roman"/>
-                <w:sz w:val="18"/>
-              </w:rPr>
-              <w:t>288.000</w:t>
-            </w:r>
-          </w:p>
-        </w:tc>
-        <w:tc>
-          <w:tcPr>
-            <w:tcW w:w="1871" w:type="dxa"/>
-            <w:vAlign w:val="center"/>
-          </w:tcPr>
-          <w:p>
-            <w:r>
-              <w:rPr>
-                <w:rFonts w:ascii="Times New Roman" w:hAnsi="Times New Roman" w:eastAsia="Times New Roman"/>
-                <w:sz w:val="18"/>
-              </w:rPr>
-              <w:t>89.000</w:t>
+            <w:r>
+              <w:t>3 (ngẫu nhiên)</w:t>
+            </w:r>
+          </w:p>
+        </w:tc>
+        <w:tc>
+          <w:tcPr>
+            <w:tcW w:w="1871" w:type="dxa"/>
+            <w:vAlign w:val="center"/>
+          </w:tcPr>
+          <w:p>
+            <w:r>
+              <w:t>109.333</w:t>
+            </w:r>
+          </w:p>
+        </w:tc>
+        <w:tc>
+          <w:tcPr>
+            <w:tcW w:w="1871" w:type="dxa"/>
+            <w:vAlign w:val="center"/>
+          </w:tcPr>
+          <w:p>
+            <w:r>
+              <w:t>312.333</w:t>
+            </w:r>
+          </w:p>
+        </w:tc>
+        <w:tc>
+          <w:tcPr>
+            <w:tcW w:w="1871" w:type="dxa"/>
+            <w:vAlign w:val="center"/>
+          </w:tcPr>
+          <w:p>
+            <w:r>
+              <w:t>432.333</w:t>
+            </w:r>
+          </w:p>
+        </w:tc>
+        <w:tc>
+          <w:tcPr>
+            <w:tcW w:w="1871" w:type="dxa"/>
+            <w:vAlign w:val="center"/>
+          </w:tcPr>
+          <w:p>
+            <w:r>
+              <w:t>117.667</w:t>
             </w:r>
           </w:p>
         </w:tc>
@@ -902,89 +805,52 @@
             <w:vAlign w:val="center"/>
           </w:tcPr>
           <w:p>
-            <w:pPr>
-              <w:jc w:val="center"/>
-            </w:pPr>
-            <w:r>
-              <w:rPr>
-                <w:rFonts w:ascii="Times New Roman" w:hAnsi="Times New Roman" w:eastAsia="Times New Roman"/>
-                <w:sz w:val="18"/>
-              </w:rPr>
-              <w:t>4 (ng</w:t>
-            </w:r>
-            <w:r>
-              <w:rPr>
-                <w:rFonts w:ascii="Times New Roman" w:hAnsi="Times New Roman" w:eastAsia="Times New Roman"/>
-                <w:sz w:val="18"/>
-              </w:rPr>
-              <w:t>ẫ</w:t>
-            </w:r>
-            <w:r>
-              <w:rPr>
-                <w:rFonts w:ascii="Times New Roman" w:hAnsi="Times New Roman" w:eastAsia="Times New Roman"/>
-                <w:sz w:val="18"/>
-              </w:rPr>
-              <w:t>u nhiên)</w:t>
-            </w:r>
-          </w:p>
-        </w:tc>
-        <w:tc>
-          <w:tcPr>
-            <w:tcW w:w="1871" w:type="dxa"/>
-            <w:vAlign w:val="center"/>
-          </w:tcPr>
-          <w:p>
-            <w:r>
-              <w:rPr>
-                <w:rFonts w:ascii="Times New Roman" w:hAnsi="Times New Roman" w:eastAsia="Times New Roman"/>
-                <w:sz w:val="18"/>
-              </w:rPr>
-              <w:t>82.000</w:t>
-            </w:r>
-          </w:p>
-        </w:tc>
-        <w:tc>
-          <w:tcPr>
-            <w:tcW w:w="1871" w:type="dxa"/>
-            <w:vAlign w:val="center"/>
-          </w:tcPr>
-          <w:p>
-            <w:r>
-              <w:rPr>
-                <w:rFonts w:ascii="Times New Roman" w:hAnsi="Times New Roman" w:eastAsia="Times New Roman"/>
-                <w:sz w:val="18"/>
-              </w:rPr>
-              <w:t>180.000</w:t>
-            </w:r>
-          </w:p>
-        </w:tc>
-        <w:tc>
-          <w:tcPr>
-            <w:tcW w:w="1871" w:type="dxa"/>
-            <w:vAlign w:val="center"/>
-          </w:tcPr>
-          <w:p>
-            <w:r>
-              <w:rPr>
-                <w:rFonts w:ascii="Times New Roman" w:hAnsi="Times New Roman" w:eastAsia="Times New Roman"/>
-                <w:sz w:val="18"/>
-              </w:rPr>
-              <w:t>296.000</w:t>
-            </w:r>
-          </w:p>
-        </w:tc>
-        <w:tc>
-          <w:tcPr>
-            <w:tcW w:w="1871" w:type="dxa"/>
-            <w:vAlign w:val="center"/>
-          </w:tcPr>
-          <w:p>
-            <w:r>
-              <w:rPr>
-                <w:rFonts w:ascii="Times New Roman" w:hAnsi="Times New Roman" w:eastAsia="Times New Roman"/>
-                <w:sz w:val="18"/>
-              </w:rPr>
-              <w:t>74.000</w:t>
+            <w:r>
+              <w:t>4 (ngẫu nhiên)</w:t>
+            </w:r>
+          </w:p>
+        </w:tc>
+        <w:tc>
+          <w:tcPr>
+            <w:tcW w:w="1871" w:type="dxa"/>
+            <w:vAlign w:val="center"/>
+          </w:tcPr>
+          <w:p>
+            <w:r>
+              <w:t>111.333</w:t>
+            </w:r>
+          </w:p>
+        </w:tc>
+        <w:tc>
+          <w:tcPr>
+            <w:tcW w:w="1871" w:type="dxa"/>
+            <w:vAlign w:val="center"/>
+          </w:tcPr>
+          <w:p>
+            <w:r>
+              <w:t>355.000</w:t>
+            </w:r>
+          </w:p>
+        </w:tc>
+        <w:tc>
+          <w:tcPr>
+            <w:tcW w:w="1871" w:type="dxa"/>
+            <w:vAlign w:val="center"/>
+          </w:tcPr>
+          <w:p>
+            <w:r>
+              <w:t>427.000</w:t>
+            </w:r>
+          </w:p>
+        </w:tc>
+        <w:tc>
+          <w:tcPr>
+            <w:tcW w:w="1871" w:type="dxa"/>
+            <w:vAlign w:val="center"/>
+          </w:tcPr>
+          <w:p>
+            <w:r>
+              <w:t>109.333</w:t>
             </w:r>
           </w:p>
         </w:tc>
@@ -999,89 +865,52 @@
             <w:vAlign w:val="center"/>
           </w:tcPr>
           <w:p>
-            <w:pPr>
-              <w:jc w:val="center"/>
-            </w:pPr>
-            <w:r>
-              <w:rPr>
-                <w:rFonts w:ascii="Times New Roman" w:hAnsi="Times New Roman" w:eastAsia="Times New Roman"/>
-                <w:sz w:val="18"/>
-              </w:rPr>
-              <w:t>5 (ng</w:t>
-            </w:r>
-            <w:r>
-              <w:rPr>
-                <w:rFonts w:ascii="Times New Roman" w:hAnsi="Times New Roman" w:eastAsia="Times New Roman"/>
-                <w:sz w:val="18"/>
-              </w:rPr>
-              <w:t>ẫ</w:t>
-            </w:r>
-            <w:r>
-              <w:rPr>
-                <w:rFonts w:ascii="Times New Roman" w:hAnsi="Times New Roman" w:eastAsia="Times New Roman"/>
-                <w:sz w:val="18"/>
-              </w:rPr>
-              <w:t>u nhiên)</w:t>
-            </w:r>
-          </w:p>
-        </w:tc>
-        <w:tc>
-          <w:tcPr>
-            <w:tcW w:w="1871" w:type="dxa"/>
-            <w:vAlign w:val="center"/>
-          </w:tcPr>
-          <w:p>
-            <w:r>
-              <w:rPr>
-                <w:rFonts w:ascii="Times New Roman" w:hAnsi="Times New Roman" w:eastAsia="Times New Roman"/>
-                <w:sz w:val="18"/>
-              </w:rPr>
-              <w:t>76.000</w:t>
-            </w:r>
-          </w:p>
-        </w:tc>
-        <w:tc>
-          <w:tcPr>
-            <w:tcW w:w="1871" w:type="dxa"/>
-            <w:vAlign w:val="center"/>
-          </w:tcPr>
-          <w:p>
-            <w:r>
-              <w:rPr>
-                <w:rFonts w:ascii="Times New Roman" w:hAnsi="Times New Roman" w:eastAsia="Times New Roman"/>
-                <w:sz w:val="18"/>
-              </w:rPr>
-              <w:t>250.000</w:t>
-            </w:r>
-          </w:p>
-        </w:tc>
-        <w:tc>
-          <w:tcPr>
-            <w:tcW w:w="1871" w:type="dxa"/>
-            <w:vAlign w:val="center"/>
-          </w:tcPr>
-          <w:p>
-            <w:r>
-              <w:rPr>
-                <w:rFonts w:ascii="Times New Roman" w:hAnsi="Times New Roman" w:eastAsia="Times New Roman"/>
-                <w:sz w:val="18"/>
-              </w:rPr>
-              <w:t>353.000</w:t>
-            </w:r>
-          </w:p>
-        </w:tc>
-        <w:tc>
-          <w:tcPr>
-            <w:tcW w:w="1871" w:type="dxa"/>
-            <w:vAlign w:val="center"/>
-          </w:tcPr>
-          <w:p>
-            <w:r>
-              <w:rPr>
-                <w:rFonts w:ascii="Times New Roman" w:hAnsi="Times New Roman" w:eastAsia="Times New Roman"/>
-                <w:sz w:val="18"/>
-              </w:rPr>
-              <w:t>88.000</w:t>
+            <w:r>
+              <w:t>5 (ngẫu nhiên)</w:t>
+            </w:r>
+          </w:p>
+        </w:tc>
+        <w:tc>
+          <w:tcPr>
+            <w:tcW w:w="1871" w:type="dxa"/>
+            <w:vAlign w:val="center"/>
+          </w:tcPr>
+          <w:p>
+            <w:r>
+              <w:t>102.000</w:t>
+            </w:r>
+          </w:p>
+        </w:tc>
+        <w:tc>
+          <w:tcPr>
+            <w:tcW w:w="1871" w:type="dxa"/>
+            <w:vAlign w:val="center"/>
+          </w:tcPr>
+          <w:p>
+            <w:r>
+              <w:t>318.333</w:t>
+            </w:r>
+          </w:p>
+        </w:tc>
+        <w:tc>
+          <w:tcPr>
+            <w:tcW w:w="1871" w:type="dxa"/>
+            <w:vAlign w:val="center"/>
+          </w:tcPr>
+          <w:p>
+            <w:r>
+              <w:t>430.333</w:t>
+            </w:r>
+          </w:p>
+        </w:tc>
+        <w:tc>
+          <w:tcPr>
+            <w:tcW w:w="1871" w:type="dxa"/>
+            <w:vAlign w:val="center"/>
+          </w:tcPr>
+          <w:p>
+            <w:r>
+              <w:t>115.333</w:t>
             </w:r>
           </w:p>
         </w:tc>
@@ -1096,89 +925,52 @@
             <w:vAlign w:val="center"/>
           </w:tcPr>
           <w:p>
-            <w:pPr>
-              <w:jc w:val="center"/>
-            </w:pPr>
-            <w:r>
-              <w:rPr>
-                <w:rFonts w:ascii="Times New Roman" w:hAnsi="Times New Roman" w:eastAsia="Times New Roman"/>
-                <w:sz w:val="18"/>
-              </w:rPr>
-              <w:t>6 (ng</w:t>
-            </w:r>
-            <w:r>
-              <w:rPr>
-                <w:rFonts w:ascii="Times New Roman" w:hAnsi="Times New Roman" w:eastAsia="Times New Roman"/>
-                <w:sz w:val="18"/>
-              </w:rPr>
-              <w:t>ẫ</w:t>
-            </w:r>
-            <w:r>
-              <w:rPr>
-                <w:rFonts w:ascii="Times New Roman" w:hAnsi="Times New Roman" w:eastAsia="Times New Roman"/>
-                <w:sz w:val="18"/>
-              </w:rPr>
-              <w:t>u nhiên)</w:t>
-            </w:r>
-          </w:p>
-        </w:tc>
-        <w:tc>
-          <w:tcPr>
-            <w:tcW w:w="1871" w:type="dxa"/>
-            <w:vAlign w:val="center"/>
-          </w:tcPr>
-          <w:p>
-            <w:r>
-              <w:rPr>
-                <w:rFonts w:ascii="Times New Roman" w:hAnsi="Times New Roman" w:eastAsia="Times New Roman"/>
-                <w:sz w:val="18"/>
-              </w:rPr>
-              <w:t>67.000</w:t>
-            </w:r>
-          </w:p>
-        </w:tc>
-        <w:tc>
-          <w:tcPr>
-            <w:tcW w:w="1871" w:type="dxa"/>
-            <w:vAlign w:val="center"/>
-          </w:tcPr>
-          <w:p>
-            <w:r>
-              <w:rPr>
-                <w:rFonts w:ascii="Times New Roman" w:hAnsi="Times New Roman" w:eastAsia="Times New Roman"/>
-                <w:sz w:val="18"/>
-              </w:rPr>
-              <w:t>217.000</w:t>
-            </w:r>
-          </w:p>
-        </w:tc>
-        <w:tc>
-          <w:tcPr>
-            <w:tcW w:w="1871" w:type="dxa"/>
-            <w:vAlign w:val="center"/>
-          </w:tcPr>
-          <w:p>
-            <w:r>
-              <w:rPr>
-                <w:rFonts w:ascii="Times New Roman" w:hAnsi="Times New Roman" w:eastAsia="Times New Roman"/>
-                <w:sz w:val="18"/>
-              </w:rPr>
-              <w:t>253.000</w:t>
-            </w:r>
-          </w:p>
-        </w:tc>
-        <w:tc>
-          <w:tcPr>
-            <w:tcW w:w="1871" w:type="dxa"/>
-            <w:vAlign w:val="center"/>
-          </w:tcPr>
-          <w:p>
-            <w:r>
-              <w:rPr>
-                <w:rFonts w:ascii="Times New Roman" w:hAnsi="Times New Roman" w:eastAsia="Times New Roman"/>
-                <w:sz w:val="18"/>
-              </w:rPr>
-              <w:t>73.000</w:t>
+            <w:r>
+              <w:t>6 (ngẫu nhiên)</w:t>
+            </w:r>
+          </w:p>
+        </w:tc>
+        <w:tc>
+          <w:tcPr>
+            <w:tcW w:w="1871" w:type="dxa"/>
+            <w:vAlign w:val="center"/>
+          </w:tcPr>
+          <w:p>
+            <w:r>
+              <w:t>118.000</w:t>
+            </w:r>
+          </w:p>
+        </w:tc>
+        <w:tc>
+          <w:tcPr>
+            <w:tcW w:w="1871" w:type="dxa"/>
+            <w:vAlign w:val="center"/>
+          </w:tcPr>
+          <w:p>
+            <w:r>
+              <w:t>345.667</w:t>
+            </w:r>
+          </w:p>
+        </w:tc>
+        <w:tc>
+          <w:tcPr>
+            <w:tcW w:w="1871" w:type="dxa"/>
+            <w:vAlign w:val="center"/>
+          </w:tcPr>
+          <w:p>
+            <w:r>
+              <w:t>422.667</w:t>
+            </w:r>
+          </w:p>
+        </w:tc>
+        <w:tc>
+          <w:tcPr>
+            <w:tcW w:w="1871" w:type="dxa"/>
+            <w:vAlign w:val="center"/>
+          </w:tcPr>
+          <w:p>
+            <w:r>
+              <w:t>118.667</w:t>
             </w:r>
           </w:p>
         </w:tc>
@@ -1193,89 +985,52 @@
             <w:vAlign w:val="center"/>
           </w:tcPr>
           <w:p>
-            <w:pPr>
-              <w:jc w:val="center"/>
-            </w:pPr>
-            <w:r>
-              <w:rPr>
-                <w:rFonts w:ascii="Times New Roman" w:hAnsi="Times New Roman" w:eastAsia="Times New Roman"/>
-                <w:sz w:val="18"/>
-              </w:rPr>
-              <w:t>7 (ng</w:t>
-            </w:r>
-            <w:r>
-              <w:rPr>
-                <w:rFonts w:ascii="Times New Roman" w:hAnsi="Times New Roman" w:eastAsia="Times New Roman"/>
-                <w:sz w:val="18"/>
-              </w:rPr>
-              <w:t>ẫ</w:t>
-            </w:r>
-            <w:r>
-              <w:rPr>
-                <w:rFonts w:ascii="Times New Roman" w:hAnsi="Times New Roman" w:eastAsia="Times New Roman"/>
-                <w:sz w:val="18"/>
-              </w:rPr>
-              <w:t>u nhiên)</w:t>
-            </w:r>
-          </w:p>
-        </w:tc>
-        <w:tc>
-          <w:tcPr>
-            <w:tcW w:w="1871" w:type="dxa"/>
-            <w:vAlign w:val="center"/>
-          </w:tcPr>
-          <w:p>
-            <w:r>
-              <w:rPr>
-                <w:rFonts w:ascii="Times New Roman" w:hAnsi="Times New Roman" w:eastAsia="Times New Roman"/>
-                <w:sz w:val="18"/>
-              </w:rPr>
-              <w:t>71.000</w:t>
-            </w:r>
-          </w:p>
-        </w:tc>
-        <w:tc>
-          <w:tcPr>
-            <w:tcW w:w="1871" w:type="dxa"/>
-            <w:vAlign w:val="center"/>
-          </w:tcPr>
-          <w:p>
-            <w:r>
-              <w:rPr>
-                <w:rFonts w:ascii="Times New Roman" w:hAnsi="Times New Roman" w:eastAsia="Times New Roman"/>
-                <w:sz w:val="18"/>
-              </w:rPr>
-              <w:t>173.000</w:t>
-            </w:r>
-          </w:p>
-        </w:tc>
-        <w:tc>
-          <w:tcPr>
-            <w:tcW w:w="1871" w:type="dxa"/>
-            <w:vAlign w:val="center"/>
-          </w:tcPr>
-          <w:p>
-            <w:r>
-              <w:rPr>
-                <w:rFonts w:ascii="Times New Roman" w:hAnsi="Times New Roman" w:eastAsia="Times New Roman"/>
-                <w:sz w:val="18"/>
-              </w:rPr>
-              <w:t>249.000</w:t>
-            </w:r>
-          </w:p>
-        </w:tc>
-        <w:tc>
-          <w:tcPr>
-            <w:tcW w:w="1871" w:type="dxa"/>
-            <w:vAlign w:val="center"/>
-          </w:tcPr>
-          <w:p>
-            <w:r>
-              <w:rPr>
-                <w:rFonts w:ascii="Times New Roman" w:hAnsi="Times New Roman" w:eastAsia="Times New Roman"/>
-                <w:sz w:val="18"/>
-              </w:rPr>
-              <w:t>69.000</w:t>
+            <w:r>
+              <w:t>7 (ngẫu nhiên)</w:t>
+            </w:r>
+          </w:p>
+        </w:tc>
+        <w:tc>
+          <w:tcPr>
+            <w:tcW w:w="1871" w:type="dxa"/>
+            <w:vAlign w:val="center"/>
+          </w:tcPr>
+          <w:p>
+            <w:r>
+              <w:t>109.667</w:t>
+            </w:r>
+          </w:p>
+        </w:tc>
+        <w:tc>
+          <w:tcPr>
+            <w:tcW w:w="1871" w:type="dxa"/>
+            <w:vAlign w:val="center"/>
+          </w:tcPr>
+          <w:p>
+            <w:r>
+              <w:t>284.000</w:t>
+            </w:r>
+          </w:p>
+        </w:tc>
+        <w:tc>
+          <w:tcPr>
+            <w:tcW w:w="1871" w:type="dxa"/>
+            <w:vAlign w:val="center"/>
+          </w:tcPr>
+          <w:p>
+            <w:r>
+              <w:t>447.333</w:t>
+            </w:r>
+          </w:p>
+        </w:tc>
+        <w:tc>
+          <w:tcPr>
+            <w:tcW w:w="1871" w:type="dxa"/>
+            <w:vAlign w:val="center"/>
+          </w:tcPr>
+          <w:p>
+            <w:r>
+              <w:t>115.333</w:t>
             </w:r>
           </w:p>
         </w:tc>
@@ -1290,89 +1045,52 @@
             <w:vAlign w:val="center"/>
           </w:tcPr>
           <w:p>
-            <w:pPr>
-              <w:jc w:val="center"/>
-            </w:pPr>
-            <w:r>
-              <w:rPr>
-                <w:rFonts w:ascii="Times New Roman" w:hAnsi="Times New Roman" w:eastAsia="Times New Roman"/>
-                <w:sz w:val="18"/>
-              </w:rPr>
-              <w:t>8 (ng</w:t>
-            </w:r>
-            <w:r>
-              <w:rPr>
-                <w:rFonts w:ascii="Times New Roman" w:hAnsi="Times New Roman" w:eastAsia="Times New Roman"/>
-                <w:sz w:val="18"/>
-              </w:rPr>
-              <w:t>ẫ</w:t>
-            </w:r>
-            <w:r>
-              <w:rPr>
-                <w:rFonts w:ascii="Times New Roman" w:hAnsi="Times New Roman" w:eastAsia="Times New Roman"/>
-                <w:sz w:val="18"/>
-              </w:rPr>
-              <w:t>u nhiên)</w:t>
-            </w:r>
-          </w:p>
-        </w:tc>
-        <w:tc>
-          <w:tcPr>
-            <w:tcW w:w="1871" w:type="dxa"/>
-            <w:vAlign w:val="center"/>
-          </w:tcPr>
-          <w:p>
-            <w:r>
-              <w:rPr>
-                <w:rFonts w:ascii="Times New Roman" w:hAnsi="Times New Roman" w:eastAsia="Times New Roman"/>
-                <w:sz w:val="18"/>
-              </w:rPr>
-              <w:t>66.000</w:t>
-            </w:r>
-          </w:p>
-        </w:tc>
-        <w:tc>
-          <w:tcPr>
-            <w:tcW w:w="1871" w:type="dxa"/>
-            <w:vAlign w:val="center"/>
-          </w:tcPr>
-          <w:p>
-            <w:r>
-              <w:rPr>
-                <w:rFonts w:ascii="Times New Roman" w:hAnsi="Times New Roman" w:eastAsia="Times New Roman"/>
-                <w:sz w:val="18"/>
-              </w:rPr>
-              <w:t>195.000</w:t>
-            </w:r>
-          </w:p>
-        </w:tc>
-        <w:tc>
-          <w:tcPr>
-            <w:tcW w:w="1871" w:type="dxa"/>
-            <w:vAlign w:val="center"/>
-          </w:tcPr>
-          <w:p>
-            <w:r>
-              <w:rPr>
-                <w:rFonts w:ascii="Times New Roman" w:hAnsi="Times New Roman" w:eastAsia="Times New Roman"/>
-                <w:sz w:val="18"/>
-              </w:rPr>
-              <w:t>255.000</w:t>
-            </w:r>
-          </w:p>
-        </w:tc>
-        <w:tc>
-          <w:tcPr>
-            <w:tcW w:w="1871" w:type="dxa"/>
-            <w:vAlign w:val="center"/>
-          </w:tcPr>
-          <w:p>
-            <w:r>
-              <w:rPr>
-                <w:rFonts w:ascii="Times New Roman" w:hAnsi="Times New Roman" w:eastAsia="Times New Roman"/>
-                <w:sz w:val="18"/>
-              </w:rPr>
-              <w:t>76.000</w:t>
+            <w:r>
+              <w:t>8 (ngẫu nhiên)</w:t>
+            </w:r>
+          </w:p>
+        </w:tc>
+        <w:tc>
+          <w:tcPr>
+            <w:tcW w:w="1871" w:type="dxa"/>
+            <w:vAlign w:val="center"/>
+          </w:tcPr>
+          <w:p>
+            <w:r>
+              <w:t>119.333</w:t>
+            </w:r>
+          </w:p>
+        </w:tc>
+        <w:tc>
+          <w:tcPr>
+            <w:tcW w:w="1871" w:type="dxa"/>
+            <w:vAlign w:val="center"/>
+          </w:tcPr>
+          <w:p>
+            <w:r>
+              <w:t>282.667</w:t>
+            </w:r>
+          </w:p>
+        </w:tc>
+        <w:tc>
+          <w:tcPr>
+            <w:tcW w:w="1871" w:type="dxa"/>
+            <w:vAlign w:val="center"/>
+          </w:tcPr>
+          <w:p>
+            <w:r>
+              <w:t>406.667</w:t>
+            </w:r>
+          </w:p>
+        </w:tc>
+        <w:tc>
+          <w:tcPr>
+            <w:tcW w:w="1871" w:type="dxa"/>
+            <w:vAlign w:val="center"/>
+          </w:tcPr>
+          <w:p>
+            <w:r>
+              <w:t>117.333</w:t>
             </w:r>
           </w:p>
         </w:tc>
@@ -1387,89 +1105,52 @@
             <w:vAlign w:val="center"/>
           </w:tcPr>
           <w:p>
-            <w:pPr>
-              <w:jc w:val="center"/>
-            </w:pPr>
-            <w:r>
-              <w:rPr>
-                <w:rFonts w:ascii="Times New Roman" w:hAnsi="Times New Roman" w:eastAsia="Times New Roman"/>
-                <w:sz w:val="18"/>
-              </w:rPr>
-              <w:t>9 (ng</w:t>
-            </w:r>
-            <w:r>
-              <w:rPr>
-                <w:rFonts w:ascii="Times New Roman" w:hAnsi="Times New Roman" w:eastAsia="Times New Roman"/>
-                <w:sz w:val="18"/>
-              </w:rPr>
-              <w:t>ẫ</w:t>
-            </w:r>
-            <w:r>
-              <w:rPr>
-                <w:rFonts w:ascii="Times New Roman" w:hAnsi="Times New Roman" w:eastAsia="Times New Roman"/>
-                <w:sz w:val="18"/>
-              </w:rPr>
-              <w:t>u nhiên)</w:t>
-            </w:r>
-          </w:p>
-        </w:tc>
-        <w:tc>
-          <w:tcPr>
-            <w:tcW w:w="1871" w:type="dxa"/>
-            <w:vAlign w:val="center"/>
-          </w:tcPr>
-          <w:p>
-            <w:r>
-              <w:rPr>
-                <w:rFonts w:ascii="Times New Roman" w:hAnsi="Times New Roman" w:eastAsia="Times New Roman"/>
-                <w:sz w:val="18"/>
-              </w:rPr>
-              <w:t>69.000</w:t>
-            </w:r>
-          </w:p>
-        </w:tc>
-        <w:tc>
-          <w:tcPr>
-            <w:tcW w:w="1871" w:type="dxa"/>
-            <w:vAlign w:val="center"/>
-          </w:tcPr>
-          <w:p>
-            <w:r>
-              <w:rPr>
-                <w:rFonts w:ascii="Times New Roman" w:hAnsi="Times New Roman" w:eastAsia="Times New Roman"/>
-                <w:sz w:val="18"/>
-              </w:rPr>
-              <w:t>223.000</w:t>
-            </w:r>
-          </w:p>
-        </w:tc>
-        <w:tc>
-          <w:tcPr>
-            <w:tcW w:w="1871" w:type="dxa"/>
-            <w:vAlign w:val="center"/>
-          </w:tcPr>
-          <w:p>
-            <w:r>
-              <w:rPr>
-                <w:rFonts w:ascii="Times New Roman" w:hAnsi="Times New Roman" w:eastAsia="Times New Roman"/>
-                <w:sz w:val="18"/>
-              </w:rPr>
-              <w:t>261.000</w:t>
-            </w:r>
-          </w:p>
-        </w:tc>
-        <w:tc>
-          <w:tcPr>
-            <w:tcW w:w="1871" w:type="dxa"/>
-            <w:vAlign w:val="center"/>
-          </w:tcPr>
-          <w:p>
-            <w:r>
-              <w:rPr>
-                <w:rFonts w:ascii="Times New Roman" w:hAnsi="Times New Roman" w:eastAsia="Times New Roman"/>
-                <w:sz w:val="18"/>
-              </w:rPr>
-              <w:t>76.000</w:t>
+            <w:r>
+              <w:t>9 (ngẫu nhiên)</w:t>
+            </w:r>
+          </w:p>
+        </w:tc>
+        <w:tc>
+          <w:tcPr>
+            <w:tcW w:w="1871" w:type="dxa"/>
+            <w:vAlign w:val="center"/>
+          </w:tcPr>
+          <w:p>
+            <w:r>
+              <w:t>111.000</w:t>
+            </w:r>
+          </w:p>
+        </w:tc>
+        <w:tc>
+          <w:tcPr>
+            <w:tcW w:w="1871" w:type="dxa"/>
+            <w:vAlign w:val="center"/>
+          </w:tcPr>
+          <w:p>
+            <w:r>
+              <w:t>320.667</w:t>
+            </w:r>
+          </w:p>
+        </w:tc>
+        <w:tc>
+          <w:tcPr>
+            <w:tcW w:w="1871" w:type="dxa"/>
+            <w:vAlign w:val="center"/>
+          </w:tcPr>
+          <w:p>
+            <w:r>
+              <w:t>405.667</w:t>
+            </w:r>
+          </w:p>
+        </w:tc>
+        <w:tc>
+          <w:tcPr>
+            <w:tcW w:w="1871" w:type="dxa"/>
+            <w:vAlign w:val="center"/>
+          </w:tcPr>
+          <w:p>
+            <w:r>
+              <w:t>109.000</w:t>
             </w:r>
           </w:p>
         </w:tc>
@@ -1484,89 +1165,52 @@
             <w:vAlign w:val="center"/>
           </w:tcPr>
           <w:p>
-            <w:pPr>
-              <w:jc w:val="center"/>
-            </w:pPr>
-            <w:r>
-              <w:rPr>
-                <w:rFonts w:ascii="Times New Roman" w:hAnsi="Times New Roman" w:eastAsia="Times New Roman"/>
-                <w:sz w:val="18"/>
-              </w:rPr>
-              <w:t>10 (ng</w:t>
-            </w:r>
-            <w:r>
-              <w:rPr>
-                <w:rFonts w:ascii="Times New Roman" w:hAnsi="Times New Roman" w:eastAsia="Times New Roman"/>
-                <w:sz w:val="18"/>
-              </w:rPr>
-              <w:t>ẫ</w:t>
-            </w:r>
-            <w:r>
-              <w:rPr>
-                <w:rFonts w:ascii="Times New Roman" w:hAnsi="Times New Roman" w:eastAsia="Times New Roman"/>
-                <w:sz w:val="18"/>
-              </w:rPr>
-              <w:t>u nhiên)</w:t>
-            </w:r>
-          </w:p>
-        </w:tc>
-        <w:tc>
-          <w:tcPr>
-            <w:tcW w:w="1871" w:type="dxa"/>
-            <w:vAlign w:val="center"/>
-          </w:tcPr>
-          <w:p>
-            <w:r>
-              <w:rPr>
-                <w:rFonts w:ascii="Times New Roman" w:hAnsi="Times New Roman" w:eastAsia="Times New Roman"/>
-                <w:sz w:val="18"/>
-              </w:rPr>
-              <w:t>63.000</w:t>
-            </w:r>
-          </w:p>
-        </w:tc>
-        <w:tc>
-          <w:tcPr>
-            <w:tcW w:w="1871" w:type="dxa"/>
-            <w:vAlign w:val="center"/>
-          </w:tcPr>
-          <w:p>
-            <w:r>
-              <w:rPr>
-                <w:rFonts w:ascii="Times New Roman" w:hAnsi="Times New Roman" w:eastAsia="Times New Roman"/>
-                <w:sz w:val="18"/>
-              </w:rPr>
-              <w:t>145.000</w:t>
-            </w:r>
-          </w:p>
-        </w:tc>
-        <w:tc>
-          <w:tcPr>
-            <w:tcW w:w="1871" w:type="dxa"/>
-            <w:vAlign w:val="center"/>
-          </w:tcPr>
-          <w:p>
-            <w:r>
-              <w:rPr>
-                <w:rFonts w:ascii="Times New Roman" w:hAnsi="Times New Roman" w:eastAsia="Times New Roman"/>
-                <w:sz w:val="18"/>
-              </w:rPr>
-              <w:t>261.000</w:t>
-            </w:r>
-          </w:p>
-        </w:tc>
-        <w:tc>
-          <w:tcPr>
-            <w:tcW w:w="1871" w:type="dxa"/>
-            <w:vAlign w:val="center"/>
-          </w:tcPr>
-          <w:p>
-            <w:r>
-              <w:rPr>
-                <w:rFonts w:ascii="Times New Roman" w:hAnsi="Times New Roman" w:eastAsia="Times New Roman"/>
-                <w:sz w:val="18"/>
-              </w:rPr>
-              <w:t>73.000</w:t>
+            <w:r>
+              <w:t>10 (ngẫu nhiên)</w:t>
+            </w:r>
+          </w:p>
+        </w:tc>
+        <w:tc>
+          <w:tcPr>
+            <w:tcW w:w="1871" w:type="dxa"/>
+            <w:vAlign w:val="center"/>
+          </w:tcPr>
+          <w:p>
+            <w:r>
+              <w:t>108.333</w:t>
+            </w:r>
+          </w:p>
+        </w:tc>
+        <w:tc>
+          <w:tcPr>
+            <w:tcW w:w="1871" w:type="dxa"/>
+            <w:vAlign w:val="center"/>
+          </w:tcPr>
+          <w:p>
+            <w:r>
+              <w:t>325.333</w:t>
+            </w:r>
+          </w:p>
+        </w:tc>
+        <w:tc>
+          <w:tcPr>
+            <w:tcW w:w="1871" w:type="dxa"/>
+            <w:vAlign w:val="center"/>
+          </w:tcPr>
+          <w:p>
+            <w:r>
+              <w:t>404.667</w:t>
+            </w:r>
+          </w:p>
+        </w:tc>
+        <w:tc>
+          <w:tcPr>
+            <w:tcW w:w="1871" w:type="dxa"/>
+            <w:vAlign w:val="center"/>
+          </w:tcPr>
+          <w:p>
+            <w:r>
+              <w:t>111.000</w:t>
             </w:r>
           </w:p>
         </w:tc>
@@ -1582,15 +1226,7 @@
             <w:vAlign w:val="center"/>
           </w:tcPr>
           <w:p>
-            <w:pPr>
-              <w:jc w:val="center"/>
-            </w:pPr>
-            <w:r>
-              <w:rPr>
-                <w:rFonts w:ascii="Times New Roman" w:hAnsi="Times New Roman" w:eastAsia="Times New Roman"/>
-                <w:b/>
-                <w:sz w:val="18"/>
-              </w:rPr>
+            <w:r>
               <w:t>Trung bình</w:t>
             </w:r>
           </w:p>
@@ -1603,11 +1239,7 @@
           </w:tcPr>
           <w:p>
             <w:r>
-              <w:rPr>
-                <w:rFonts w:ascii="Times New Roman" w:hAnsi="Times New Roman" w:eastAsia="Times New Roman"/>
-                <w:sz w:val="18"/>
-              </w:rPr>
-              <w:t>60.600</w:t>
+              <w:t>91.967</w:t>
             </w:r>
           </w:p>
         </w:tc>
@@ -1619,11 +1251,7 @@
           </w:tcPr>
           <w:p>
             <w:r>
-              <w:rPr>
-                <w:rFonts w:ascii="Times New Roman" w:hAnsi="Times New Roman" w:eastAsia="Times New Roman"/>
-                <w:sz w:val="18"/>
-              </w:rPr>
-              <w:t>175.100</w:t>
+              <w:t>292.600</w:t>
             </w:r>
           </w:p>
         </w:tc>
@@ -1635,11 +1263,7 @@
           </w:tcPr>
           <w:p>
             <w:r>
-              <w:rPr>
-                <w:rFonts w:ascii="Times New Roman" w:hAnsi="Times New Roman" w:eastAsia="Times New Roman"/>
-                <w:sz w:val="18"/>
-              </w:rPr>
-              <w:t>257.600</w:t>
+              <w:t>406.233</w:t>
             </w:r>
           </w:p>
         </w:tc>
@@ -1651,11 +1275,7 @@
           </w:tcPr>
           <w:p>
             <w:r>
-              <w:rPr>
-                <w:rFonts w:ascii="Times New Roman" w:hAnsi="Times New Roman" w:eastAsia="Times New Roman"/>
-                <w:sz w:val="18"/>
-              </w:rPr>
-              <w:t>63.400</w:t>
+              <w:t>94.100</w:t>
             </w:r>
           </w:p>
         </w:tc>
@@ -1670,91 +1290,77 @@
         <w:rPr>
           <w:i/>
         </w:rPr>
-        <w:t>B</w:t>
-      </w:r>
-      <w:r>
-        <w:rPr>
-          <w:i/>
-        </w:rPr>
-        <w:t>ả</w:t>
-      </w:r>
-      <w:r>
-        <w:rPr>
-          <w:i/>
-        </w:rPr>
-        <w:t>ng 1. Th</w:t>
-      </w:r>
-      <w:r>
-        <w:rPr>
-          <w:i/>
-        </w:rPr>
-        <w:t>ờ</w:t>
-      </w:r>
-      <w:r>
-        <w:rPr>
-          <w:i/>
-        </w:rPr>
-        <w:t>i gian th</w:t>
-      </w:r>
-      <w:r>
-        <w:rPr>
-          <w:i/>
-        </w:rPr>
-        <w:t>ự</w:t>
-      </w:r>
-      <w:r>
-        <w:rPr>
-          <w:i/>
-        </w:rPr>
-        <w:t>c hi</w:t>
-      </w:r>
-      <w:r>
-        <w:rPr>
-          <w:i/>
-        </w:rPr>
-        <w:t>ệ</w:t>
-      </w:r>
-      <w:r>
-        <w:rPr>
-          <w:i/>
-        </w:rPr>
-        <w:t>n c</w:t>
-      </w:r>
-      <w:r>
-        <w:rPr>
-          <w:i/>
-        </w:rPr>
-        <w:t>ủ</w:t>
-      </w:r>
-      <w:r>
-        <w:rPr>
-          <w:i/>
-        </w:rPr>
-        <w:t>a b</w:t>
-      </w:r>
-      <w:r>
-        <w:rPr>
-          <w:i/>
-        </w:rPr>
-        <w:t>ố</w:t>
-      </w:r>
-      <w:r>
-        <w:rPr>
-          <w:i/>
-        </w:rPr>
-        <w:t>n thu</w:t>
-      </w:r>
-      <w:r>
-        <w:rPr>
-          <w:i/>
-        </w:rPr>
-        <w:t>ậ</w:t>
-      </w:r>
-      <w:r>
-        <w:rPr>
-          <w:i/>
-        </w:rPr>
-        <w:t>t toán.</w:t>
+        <w:t>Bảng 1. Thời gian thực hiện trung bình của bốn thuật toán sau 3 lần chạy.</w:t>
+      </w:r>
+      <w:r>
+        <w:rPr>
+          <w:i/>
+        </w:rPr>
+      </w:r>
+      <w:r>
+        <w:rPr>
+          <w:i/>
+        </w:rPr>
+      </w:r>
+      <w:r>
+        <w:rPr>
+          <w:i/>
+        </w:rPr>
+      </w:r>
+      <w:r>
+        <w:rPr>
+          <w:i/>
+        </w:rPr>
+      </w:r>
+      <w:r>
+        <w:rPr>
+          <w:i/>
+        </w:rPr>
+      </w:r>
+      <w:r>
+        <w:rPr>
+          <w:i/>
+        </w:rPr>
+      </w:r>
+      <w:r>
+        <w:rPr>
+          <w:i/>
+        </w:rPr>
+      </w:r>
+      <w:r>
+        <w:rPr>
+          <w:i/>
+        </w:rPr>
+      </w:r>
+      <w:r>
+        <w:rPr>
+          <w:i/>
+        </w:rPr>
+      </w:r>
+      <w:r>
+        <w:rPr>
+          <w:i/>
+        </w:rPr>
+      </w:r>
+      <w:r>
+        <w:rPr>
+          <w:i/>
+        </w:rPr>
+      </w:r>
+      <w:r>
+        <w:rPr>
+          <w:i/>
+        </w:rPr>
+      </w:r>
+      <w:r>
+        <w:rPr>
+          <w:i/>
+        </w:rPr>
+      </w:r>
+      <w:r>
+        <w:rPr>
+          <w:i/>
+        </w:rPr>
       </w:r>
     </w:p>
     <w:p>
@@ -1917,79 +1523,67 @@
         <w:rPr>
           <w:i/>
         </w:rPr>
-        <w:t>Hình 1. So sánh th</w:t>
-      </w:r>
-      <w:r>
-        <w:rPr>
-          <w:i/>
-        </w:rPr>
-        <w:t>ờ</w:t>
-      </w:r>
-      <w:r>
-        <w:rPr>
-          <w:i/>
-        </w:rPr>
-        <w:t>i gian th</w:t>
-      </w:r>
-      <w:r>
-        <w:rPr>
-          <w:i/>
-        </w:rPr>
-        <w:t>ự</w:t>
-      </w:r>
-      <w:r>
-        <w:rPr>
-          <w:i/>
-        </w:rPr>
-        <w:t>c hi</w:t>
-      </w:r>
-      <w:r>
-        <w:rPr>
-          <w:i/>
-        </w:rPr>
-        <w:t>ệ</w:t>
-      </w:r>
-      <w:r>
-        <w:rPr>
-          <w:i/>
-        </w:rPr>
-        <w:t>n trên 10 b</w:t>
-      </w:r>
-      <w:r>
-        <w:rPr>
-          <w:i/>
-        </w:rPr>
-        <w:t>ộ</w:t>
-      </w:r>
-      <w:r>
-        <w:rPr>
-          <w:i/>
-        </w:rPr>
-        <w:t xml:space="preserve"> d</w:t>
-      </w:r>
-      <w:r>
-        <w:rPr>
-          <w:i/>
-        </w:rPr>
-        <w:t>ữ</w:t>
-      </w:r>
-      <w:r>
-        <w:rPr>
-          <w:i/>
-        </w:rPr>
-        <w:t xml:space="preserve"> li</w:t>
-      </w:r>
-      <w:r>
-        <w:rPr>
-          <w:i/>
-        </w:rPr>
-        <w:t>ệ</w:t>
-      </w:r>
-      <w:r>
-        <w:rPr>
-          <w:i/>
-        </w:rPr>
-        <w:t>u.</w:t>
+        <w:t>Hình 1. So sánh thời gian trung bình trên 10 bộ dữ liệu.</w:t>
+      </w:r>
+      <w:r>
+        <w:rPr>
+          <w:i/>
+        </w:rPr>
+      </w:r>
+      <w:r>
+        <w:rPr>
+          <w:i/>
+        </w:rPr>
+      </w:r>
+      <w:r>
+        <w:rPr>
+          <w:i/>
+        </w:rPr>
+      </w:r>
+      <w:r>
+        <w:rPr>
+          <w:i/>
+        </w:rPr>
+      </w:r>
+      <w:r>
+        <w:rPr>
+          <w:i/>
+        </w:rPr>
+      </w:r>
+      <w:r>
+        <w:rPr>
+          <w:i/>
+        </w:rPr>
+      </w:r>
+      <w:r>
+        <w:rPr>
+          <w:i/>
+        </w:rPr>
+      </w:r>
+      <w:r>
+        <w:rPr>
+          <w:i/>
+        </w:rPr>
+      </w:r>
+      <w:r>
+        <w:rPr>
+          <w:i/>
+        </w:rPr>
+      </w:r>
+      <w:r>
+        <w:rPr>
+          <w:i/>
+        </w:rPr>
+      </w:r>
+      <w:r>
+        <w:rPr>
+          <w:i/>
+        </w:rPr>
+      </w:r>
+      <w:r>
+        <w:rPr>
+          <w:i/>
+        </w:rPr>
       </w:r>
     </w:p>
     <w:p>
@@ -2198,7 +1792,7 @@
           <w:rFonts w:ascii="Times New Roman" w:hAnsi="Times New Roman" w:eastAsia="Times New Roman"/>
           <w:sz w:val="24"/>
         </w:rPr>
-        <w:t>• Thời gian sắp xếp được đo trực tiếp trong hàm main bằng clock(); thời gian tạo dữ liệu không được tính.</w:t>
+        <w:t>• Mỗi chương trình được biên dịch bằng tùy chọn /O2 và chạy 3 lần. Thời gian sắp xếp được đo trong hàm main bằng clock(); thời gian tạo dữ liệu không được tính.</w:t>
       </w:r>
     </w:p>
     <w:p>
@@ -2212,7 +1806,7 @@
           <w:rFonts w:ascii="Times New Roman" w:hAnsi="Times New Roman" w:eastAsia="Times New Roman"/>
           <w:sz w:val="24"/>
         </w:rPr>
-        <w:t>• Trên hai dãy đã có thứ tự, QuickSort và sort của C++ chạy nhanh hơn rõ rệt so với HeapSort và MergeSort.</w:t>
+        <w:t>• Trên hai dãy đã có thứ tự, QuickSort và sort của C++ chạy nhanh hơn rõ rệt so với trên các dãy ngẫu nhiên.</w:t>
       </w:r>
     </w:p>
     <w:p>
@@ -2226,7 +1820,7 @@
           <w:rFonts w:ascii="Times New Roman" w:hAnsi="Times New Roman" w:eastAsia="Times New Roman"/>
           <w:sz w:val="24"/>
         </w:rPr>
-        <w:t>• Ở 8 dãy ngẫu nhiên, QuickSort và sort của C++ có thời gian khá gần nhau, chủ yếu từ 63 đến 90 ms.</w:t>
+        <w:t>• Với 8 dãy ngẫu nhiên, QuickSort dao động từ 102.000 đến 119.333 ms, còn sort của C++ dao động từ 109.000 đến 118.667 ms.</w:t>
       </w:r>
     </w:p>
     <w:p>
@@ -2240,7 +1834,7 @@
           <w:rFonts w:ascii="Times New Roman" w:hAnsi="Times New Roman" w:eastAsia="Times New Roman"/>
           <w:sz w:val="24"/>
         </w:rPr>
-        <w:t>• Trên các dãy ngẫu nhiên, HeapSort dao động từ 145 đến 250 ms, còn MergeSort dao động từ 249 đến 353 ms và thường chạy chậm nhất.</w:t>
+        <w:t>• HeapSort có thời gian trung bình từ 282.667 đến 355.000 ms trên các dãy ngẫu nhiên. MergeSort dao động từ 404.667 đến 447.333 ms và chậm nhất trong thử nghiệm này.</w:t>
       </w:r>
     </w:p>
     <w:p>
@@ -2254,7 +1848,7 @@
           <w:rFonts w:ascii="Times New Roman" w:hAnsi="Times New Roman" w:eastAsia="Times New Roman"/>
           <w:sz w:val="24"/>
         </w:rPr>
-        <w:t>• Thời gian trung bình của QuickSort, HeapSort, MergeSort và sort (C++) lần lượt là 60.600, 175.100, 257.600 và 63.400 ms.</w:t>
+        <w:t>• Thời gian trung bình của QuickSort, HeapSort, MergeSort và sort (C++) lần lượt là 91.967, 292.600, 406.233 và 94.100 ms.</w:t>
       </w:r>
     </w:p>
     <w:p>
@@ -2305,7 +1899,7 @@
           <w:rFonts w:ascii="Times New Roman" w:hAnsi="Times New Roman" w:eastAsia="Times New Roman"/>
           <w:sz w:val="24"/>
         </w:rPr>
-        <w:t>Qua kết quả thử nghiệm, QuickSort có thời gian trung bình thấp nhất là 60.600 ms, gần với hàm sort của C++ là 63.400 ms. HeapSort chậy chậm hơn, còn MergeSort có thời gian trung bình cao nhất. Kết quả cho thấy thời gian chạy thay đổi khá rõ giữa các thuật toán dù cùng sử dụng một bộ dữ liệu.</w:t>
+        <w:t>Qua thử nghiệm, QuickSort có thời gian trung bình thấp nhất là 91.967 ms, gần với hàm sort của C++ là 94.100 ms. HeapSort mất nhiều thời gian hơn, còn MergeSort có thời gian trung bình cao nhất. Kết quả cũng cho thấy dữ liệu đã có thứ tự được QuickSort và sort của C++ xử lý nhanh hơn nhiều so với dữ liệu ngẫu nhiên.</w:t>
       </w:r>
     </w:p>
     <w:p>

</xml_diff>

<commit_message>
chinh sua nhan xet ket qua
</commit_message>
<xml_diff>
--- a/report/Sorting_Report_Template.docx
+++ b/report/Sorting_Report_Template.docx
@@ -1792,7 +1792,7 @@
           <w:rFonts w:ascii="Times New Roman" w:hAnsi="Times New Roman" w:eastAsia="Times New Roman"/>
           <w:sz w:val="24"/>
         </w:rPr>
-        <w:t>• Mỗi chương trình được biên dịch bằng tùy chọn /O2 và chạy 3 lần. Thời gian sắp xếp được đo trong hàm main bằng clock(); thời gian tạo dữ liệu không được tính.</w:t>
+        <w:t>• Mỗi thuật toán được biên dịch với tùy chọn /O2 và chạy 3 lần. Bảng trình bày thời gian trung bình của riêng thao tác sắp xếp; thời gian tạo dữ liệu không được tính.</w:t>
       </w:r>
     </w:p>
     <w:p>
@@ -1806,7 +1806,7 @@
           <w:rFonts w:ascii="Times New Roman" w:hAnsi="Times New Roman" w:eastAsia="Times New Roman"/>
           <w:sz w:val="24"/>
         </w:rPr>
-        <w:t>• Trên hai dãy đã có thứ tự, QuickSort và sort của C++ chạy nhanh hơn rõ rệt so với trên các dãy ngẫu nhiên.</w:t>
+        <w:t>• Giá trị thời gian thấp ở bộ 1 và bộ 2 phù hợp với đặc điểm của QuickSort trong chương trình. Việc chọn phần tử giữa làm pivot giúp hai dãy có thứ tự được phân hoạch thành các phần gần bằng nhau; riêng dãy tăng chỉ phát sinh ít phép hoán đổi. Kết quả so sánh có quy luật cũng làm giảm số lần dự đoán sai nhánh của bộ xử lý so với dữ liệu ngẫu nhiên.</w:t>
       </w:r>
     </w:p>
     <w:p>
@@ -1820,7 +1820,7 @@
           <w:rFonts w:ascii="Times New Roman" w:hAnsi="Times New Roman" w:eastAsia="Times New Roman"/>
           <w:sz w:val="24"/>
         </w:rPr>
-        <w:t>• Với 8 dãy ngẫu nhiên, QuickSort dao động từ 102.000 đến 119.333 ms, còn sort của C++ dao động từ 109.000 đến 118.667 ms.</w:t>
+        <w:t>• sort của C++ cũng đạt thời gian thấp trên hai dãy có thứ tự. Với 8 dãy ngẫu nhiên, QuickSort dao động từ 102.000 đến 119.333 ms, còn sort của C++ dao động từ 109.000 đến 118.667 ms.</w:t>
       </w:r>
     </w:p>
     <w:p>
@@ -1834,7 +1834,7 @@
           <w:rFonts w:ascii="Times New Roman" w:hAnsi="Times New Roman" w:eastAsia="Times New Roman"/>
           <w:sz w:val="24"/>
         </w:rPr>
-        <w:t>• HeapSort có thời gian trung bình từ 282.667 đến 355.000 ms trên các dãy ngẫu nhiên. MergeSort dao động từ 404.667 đến 447.333 ms và chậm nhất trong thử nghiệm này.</w:t>
+        <w:t>• HeapSort có thời gian từ 282.667 đến 355.000 ms trên các dãy ngẫu nhiên. MergeSort dao động từ 404.667 đến 447.333 ms do vẫn phải chia dãy, tạo mảng tạm và trộn toàn bộ dữ liệu ở mỗi lần chạy.</w:t>
       </w:r>
     </w:p>
     <w:p>
@@ -1848,7 +1848,7 @@
           <w:rFonts w:ascii="Times New Roman" w:hAnsi="Times New Roman" w:eastAsia="Times New Roman"/>
           <w:sz w:val="24"/>
         </w:rPr>
-        <w:t>• Thời gian trung bình của QuickSort, HeapSort, MergeSort và sort (C++) lần lượt là 91.967, 292.600, 406.233 và 94.100 ms.</w:t>
+        <w:t>• Thời gian trung bình của QuickSort, HeapSort, MergeSort và sort (C++) lần lượt là 91.967, 292.600, 406.233 và 94.100 ms. Chênh lệch giữa QuickSort và sort của C++ khá nhỏ nên chưa đủ để khẳng định thuật toán nào luôn nhanh hơn.</w:t>
       </w:r>
     </w:p>
     <w:p>
@@ -1899,7 +1899,7 @@
           <w:rFonts w:ascii="Times New Roman" w:hAnsi="Times New Roman" w:eastAsia="Times New Roman"/>
           <w:sz w:val="24"/>
         </w:rPr>
-        <w:t>Qua thử nghiệm, QuickSort có thời gian trung bình thấp nhất là 91.967 ms, gần với hàm sort của C++ là 94.100 ms. HeapSort mất nhiều thời gian hơn, còn MergeSort có thời gian trung bình cao nhất. Kết quả cũng cho thấy dữ liệu đã có thứ tự được QuickSort và sort của C++ xử lý nhanh hơn nhiều so với dữ liệu ngẫu nhiên.</w:t>
+        <w:t>Trong điều kiện thử nghiệm này, QuickSort và sort của C++ có thời gian trung bình gần tương đương và thấp hơn HeapSort, MergeSort. Thứ tự ban đầu của dữ liệu ảnh hưởng rõ đến QuickSort và sort của C++, trong khi MergeSort ít thay đổi hơn. Kết quả chỉ phản ánh máy tính, trình biên dịch và các bộ dữ liệu đã sử dụng trong bài.</w:t>
       </w:r>
     </w:p>
     <w:p>

</xml_diff>